<commit_message>
﻿audit: apply DOCX-backed semantic renormalization for BM-052 BM-062 BM-063 BM-066
Mutates structural SOT: normalized DOCX placeholders for BM-052, BM-062,
BM-063, BM-066 — replacing generic personLine/documentCode/decisionLine
placeholders with precise semantic slot paths (person.fullName,
person.birthInfoLine, person.nationalityEthnicityReligionLine,
signature.signerName, measure.reasonLine, assignment.participantLine*,
document.recordLocationName, etc.).

Updates corresponding locked contract semantic paths/slots/bindings with
renderRepairEvidence blocks documenting each canonical field rewrite.

Regenerates compiled-v2 for the four BMs by official compiler.

Includes DOCX placeholder renormalization evidence reports and
source-backed semantic batch reports documenting backup paths.

- Excludes source-code lane (expression.ts, v1-adapter.ts, etc.)
- Excludes backup folders (BACKUP_HOLD_UNTRACKED policy)
- C3 locked/compiled: 213/213
- C2 contract sync: 213/213 matched, 0 stale
</commit_message>
<xml_diff>
--- a/storage/templates/normalized-docx/BM-052/BM-052_normalized.docx
+++ b/storage/templates/normalized-docx/BM-052/BM-052_normalized.docx
@@ -942,7 +942,7 @@
         <w:rPr>
           <w:rFonts w:cs="Times New Roman" w:ascii="Times New Roman" w:hAnsi="Times New Roman"/>
         </w:rPr>
-        <w:t xml:space="preserve">{{decision.decisionLine2}}</w:t>
+        <w:t xml:space="preserve">{{person.fullName}}</w:t>
       </w:r>
     </w:p>
     <w:p>
@@ -976,7 +976,7 @@
           <w:rFonts w:cs="Times New Roman" w:ascii="Times New Roman" w:hAnsi="Times New Roman"/>
           <w:szCs w:val="28"/>
         </w:rPr>
-        <w:t>{{decision.decisionLine2}}</w:t>
+        <w:t>{{person.fullName}}</w:t>
       </w:r>
     </w:p>
     <w:p>
@@ -1085,7 +1085,7 @@
           <w:spacing w:val="-2"/>
           <w:szCs w:val="28"/>
         </w:rPr>
-        <w:t>{{recipients.personLine6}}</w:t>
+        <w:t>{{person.otherName}}</w:t>
       </w:r>
     </w:p>
     <w:p>
@@ -1111,7 +1111,7 @@
           <w:spacing w:val="-2"/>
           <w:szCs w:val="28"/>
         </w:rPr>
-        <w:t>{{recipients.personLine6}}</w:t>
+        <w:t>{{person.birthInfoLine}}</w:t>
       </w:r>
     </w:p>
     <w:p>
@@ -1137,7 +1137,7 @@
           <w:spacing w:val="-2"/>
           <w:szCs w:val="28"/>
         </w:rPr>
-        <w:t>{{recipients.personLine6}}</w:t>
+        <w:t>{{person.nationalityEthnicityReligionLine}}</w:t>
         <w:tab/>
         <w:tab/>
         <w:t xml:space="preserve"> </w:t>
@@ -1218,7 +1218,7 @@
           <w:spacing w:val="-2"/>
           <w:szCs w:val="28"/>
         </w:rPr>
-        <w:t xml:space="preserve">{{recipients.personLine6}}</w:t>
+        <w:t xml:space="preserve">{{person.idNumber}}</w:t>
         <w:tab/>
         <w:tab/>
       </w:r>
@@ -1327,7 +1327,7 @@
           <w:szCs w:val="28"/>
           <w:lang w:eastAsia="vi-VN"/>
         </w:rPr>
-        <w:t>{{recipients.personLine6}}</w:t>
+        <w:t>{{person.temporaryAddress}}</w:t>
       </w:r>
     </w:p>
     <w:p>
@@ -1595,7 +1595,7 @@
                 <w:bCs/>
                 <w:sz w:val="24"/>
               </w:rPr>
-              <w:t>{{recipients.personLine6}}</w:t>
+              <w:t>{{signature.signerName}}</w:t>
             </w:r>
           </w:p>
           <w:p>

</xml_diff>